<commit_message>
Final: Kodlar ve gorseller eklendi (Buyuk veri seti haric tutuldu)
</commit_message>
<xml_diff>
--- a/notlar.docx
+++ b/notlar.docx
@@ -186,7 +186,158 @@
         <w:t xml:space="preserve"> Tüm bu işlemleri birbirine bağlayarak, verinin bir dosyadan temizlenip diğer dosyada otomatik olarak görselleştirilmesini sağlayan merkezi bir kontrol mekanizması kurduk.</w:t>
       </w:r>
     </w:p>
-    <w:p/>
+    <w:p>
+      <w:r>
+        <w:t>[</w:t>
+      </w:r>
+      <w:r>
+        <w:t>1</w:t>
+      </w:r>
+      <w:r>
+        <w:t xml:space="preserve">] </w:t>
+      </w:r>
+      <w:proofErr w:type="spellStart"/>
+      <w:r>
+        <w:t>analyse.py'yi</w:t>
+      </w:r>
+      <w:proofErr w:type="spellEnd"/>
+      <w:r>
+        <w:t xml:space="preserve"> aç, </w:t>
+      </w:r>
+      <w:proofErr w:type="spellStart"/>
+      <w:r>
+        <w:t>power_loss</w:t>
+      </w:r>
+      <w:proofErr w:type="spellEnd"/>
+      <w:r>
+        <w:t xml:space="preserve"> sütununu hesaplat.  </w:t>
+      </w:r>
+      <w:r>
+        <w:t>(</w:t>
+      </w:r>
+      <w:r>
+        <w:rPr>
+          <w:i/>
+          <w:iCs/>
+        </w:rPr>
+        <w:t>"Sadece ham sensör verilerini kullanmadık; elektriksel giriş gücünü hesaplayan kendi '</w:t>
+      </w:r>
+      <w:proofErr w:type="spellStart"/>
+      <w:r>
+        <w:rPr>
+          <w:i/>
+          <w:iCs/>
+        </w:rPr>
+        <w:t>power_loss</w:t>
+      </w:r>
+      <w:proofErr w:type="spellEnd"/>
+      <w:r>
+        <w:rPr>
+          <w:i/>
+          <w:iCs/>
+        </w:rPr>
+        <w:t>' parametremizi de sisteme entegre ederek motorun enerji verimliliğini analizimize dahil ettik"</w:t>
+      </w:r>
+      <w:r>
+        <w:rPr>
+          <w:i/>
+          <w:iCs/>
+        </w:rPr>
+        <w:t>)</w:t>
+      </w:r>
+    </w:p>
+    <w:p>
+      <w:r>
+        <w:t>[</w:t>
+      </w:r>
+      <w:r>
+        <w:t>2</w:t>
+      </w:r>
+      <w:r>
+        <w:t xml:space="preserve">] Tüm 9 sütuna birden IQR ve Normalizasyon uygula.  </w:t>
+      </w:r>
+    </w:p>
+    <w:p>
+      <w:r>
+        <w:t>[</w:t>
+      </w:r>
+      <w:r>
+        <w:t>3</w:t>
+      </w:r>
+      <w:r>
+        <w:t xml:space="preserve">] </w:t>
+      </w:r>
+      <w:proofErr w:type="spellStart"/>
+      <w:r>
+        <w:t>train.py'de</w:t>
+      </w:r>
+      <w:proofErr w:type="spellEnd"/>
+      <w:r>
+        <w:t xml:space="preserve"> modeli bu 9 sütunla eğit.  </w:t>
+      </w:r>
+    </w:p>
+    <w:p>
+      <w:r>
+        <w:t>[</w:t>
+      </w:r>
+      <w:r>
+        <w:t>4</w:t>
+      </w:r>
+      <w:r>
+        <w:t xml:space="preserve">] visualize.py ile yeni "Kayıp" grafiklerini üret.  </w:t>
+      </w:r>
+    </w:p>
+    <w:p>
+      <w:r>
+        <w:t>[</w:t>
+      </w:r>
+      <w:r>
+        <w:t>5</w:t>
+      </w:r>
+      <w:r>
+        <w:t xml:space="preserve">] </w:t>
+      </w:r>
+      <w:proofErr w:type="spellStart"/>
+      <w:r>
+        <w:t>GitHub'a</w:t>
+      </w:r>
+      <w:proofErr w:type="spellEnd"/>
+      <w:r>
+        <w:t xml:space="preserve"> "Final Model </w:t>
+      </w:r>
+      <w:proofErr w:type="spellStart"/>
+      <w:r>
+        <w:t>with</w:t>
+      </w:r>
+      <w:proofErr w:type="spellEnd"/>
+      <w:r>
+        <w:t xml:space="preserve"> </w:t>
+      </w:r>
+      <w:proofErr w:type="spellStart"/>
+      <w:r>
+        <w:t>Feature</w:t>
+      </w:r>
+      <w:proofErr w:type="spellEnd"/>
+      <w:r>
+        <w:t xml:space="preserve"> </w:t>
+      </w:r>
+      <w:proofErr w:type="spellStart"/>
+      <w:r>
+        <w:t>Engineering</w:t>
+      </w:r>
+      <w:proofErr w:type="spellEnd"/>
+      <w:r>
+        <w:t xml:space="preserve">" mesajıyla </w:t>
+      </w:r>
+      <w:proofErr w:type="spellStart"/>
+      <w:r>
+        <w:t>push</w:t>
+      </w:r>
+      <w:proofErr w:type="spellEnd"/>
+      <w:r>
+        <w:t xml:space="preserve"> yap.</w:t>
+      </w:r>
+    </w:p>
     <w:sectPr>
       <w:pgSz w:w="11906" w:h="16838"/>
       <w:pgMar w:top="1417" w:right="1417" w:bottom="1417" w:left="1417" w:header="708" w:footer="708" w:gutter="0"/>

</xml_diff>